<commit_message>
Overnatning kan nu tilføjes som periode i stedet for enkeltvis
</commit_message>
<xml_diff>
--- a/Dataflow for ddd-filer.docx
+++ b/Dataflow for ddd-filer.docx
@@ -279,7 +279,13 @@
     </w:p>
     <w:p>
       <w:r>
-        <w:t xml:space="preserve">Den nye mulighed er, at Thomas har fået sat en boks op i chaufførrummet, som gør det muligt for chauffører, der skal på </w:t>
+        <w:t>Den nye mulighed er, at Thomas</w:t>
+      </w:r>
+      <w:r>
+        <w:t xml:space="preserve"> (TJE)</w:t>
+      </w:r>
+      <w:r>
+        <w:t xml:space="preserve"> har fået sat en boks op i chaufførrummet, som gør det muligt for chauffører, der skal på </w:t>
       </w:r>
       <w:r>
         <w:t>have planlagt fravær</w:t>
@@ -330,6 +336,7 @@
         <w:t>. Det er derfor en mulighed at tage fat i dem direkte og høre, hvad det kræver at få dem til at videredistribuere direkte til Poul Schou, således der ikke skal downloades filer manuelt – ligesom der heller ikke manuelt ville skulle importeres filer. OBS er dog, at vi har mange chauffører, der ikke er oprettet i PS Løn, da deres løn forberedes/beregnes i Excel ark sideløbende. En generel videredistribution vil derfor give markant flere filer end det antal, der downloades i dag.</w:t>
       </w:r>
     </w:p>
+    <w:p/>
     <w:sectPr>
       <w:pgSz w:w="11906" w:h="16838"/>
       <w:pgMar w:top="1701" w:right="1134" w:bottom="1701" w:left="1134" w:header="708" w:footer="708" w:gutter="0"/>

</xml_diff>